<commit_message>
update course material post-teaching
</commit_message>
<xml_diff>
--- a/docs/DSR-II2026_program.docx
+++ b/docs/DSR-II2026_program.docx
@@ -1,6 +1,6 @@
 
 <file path=word/document.xml><?xml version="1.0" encoding="utf-8"?>
-<w:document xmlns:wpc="http://schemas.microsoft.com/office/word/2010/wordprocessingCanvas" xmlns:cx="http://schemas.microsoft.com/office/drawing/2014/chartex" xmlns:cx1="http://schemas.microsoft.com/office/drawing/2015/9/8/chartex" xmlns:cx2="http://schemas.microsoft.com/office/drawing/2015/10/21/chartex" xmlns:cx3="http://schemas.microsoft.com/office/drawing/2016/5/9/chartex" xmlns:cx4="http://schemas.microsoft.com/office/drawing/2016/5/10/chartex" xmlns:cx5="http://schemas.microsoft.com/office/drawing/2016/5/11/chartex" xmlns:cx6="http://schemas.microsoft.com/office/drawing/2016/5/12/chartex" xmlns:cx7="http://schemas.microsoft.com/office/drawing/2016/5/13/chartex" xmlns:cx8="http://schemas.microsoft.com/office/drawing/2016/5/14/chartex" xmlns:mc="http://schemas.openxmlformats.org/markup-compatibility/2006" xmlns:aink="http://schemas.microsoft.com/office/drawing/2016/ink" xmlns:am3d="http://schemas.microsoft.com/office/drawing/2017/model3d" xmlns:o="urn:schemas-microsoft-com:office:office" xmlns:oel="http://schemas.microsoft.com/office/2019/extlst" xmlns:r="http://schemas.openxmlformats.org/officeDocument/2006/relationships" xmlns:m="http://schemas.openxmlformats.org/officeDocument/2006/math" xmlns:v="urn:schemas-microsoft-com:vml" xmlns:wp14="http://schemas.microsoft.com/office/word/2010/wordprocessingDrawing" xmlns:wp="http://schemas.openxmlformats.org/drawingml/2006/wordprocessingDrawing" xmlns:w10="urn:schemas-microsoft-com:office:word" xmlns:w="http://schemas.openxmlformats.org/wordprocessingml/2006/main" xmlns:w14="http://schemas.microsoft.com/office/word/2010/wordml" xmlns:w15="http://schemas.microsoft.com/office/word/2012/wordml" xmlns:w16cex="http://schemas.microsoft.com/office/word/2018/wordml/cex" xmlns:w16cid="http://schemas.microsoft.com/office/word/2016/wordml/cid" xmlns:w16="http://schemas.microsoft.com/office/word/2018/wordml" xmlns:w16du="http://schemas.microsoft.com/office/word/2023/wordml/word16du" xmlns:w16sdtdh="http://schemas.microsoft.com/office/word/2020/wordml/sdtdatahash" xmlns:w16se="http://schemas.microsoft.com/office/word/2015/wordml/symex" xmlns:wpg="http://schemas.microsoft.com/office/word/2010/wordprocessingGroup" xmlns:wpi="http://schemas.microsoft.com/office/word/2010/wordprocessingInk" xmlns:wne="http://schemas.microsoft.com/office/word/2006/wordml" xmlns:wps="http://schemas.microsoft.com/office/word/2010/wordprocessingShape" mc:Ignorable="w14 w15 w16se w16cid w16 w16cex w16sdtdh w16du wp14">
+<w:document xmlns:wpc="http://schemas.microsoft.com/office/word/2010/wordprocessingCanvas" xmlns:cx="http://schemas.microsoft.com/office/drawing/2014/chartex" xmlns:cx1="http://schemas.microsoft.com/office/drawing/2015/9/8/chartex" xmlns:cx2="http://schemas.microsoft.com/office/drawing/2015/10/21/chartex" xmlns:cx3="http://schemas.microsoft.com/office/drawing/2016/5/9/chartex" xmlns:cx4="http://schemas.microsoft.com/office/drawing/2016/5/10/chartex" xmlns:cx5="http://schemas.microsoft.com/office/drawing/2016/5/11/chartex" xmlns:cx6="http://schemas.microsoft.com/office/drawing/2016/5/12/chartex" xmlns:cx7="http://schemas.microsoft.com/office/drawing/2016/5/13/chartex" xmlns:cx8="http://schemas.microsoft.com/office/drawing/2016/5/14/chartex" xmlns:mc="http://schemas.openxmlformats.org/markup-compatibility/2006" xmlns:aink="http://schemas.microsoft.com/office/drawing/2016/ink" xmlns:am3d="http://schemas.microsoft.com/office/drawing/2017/model3d" xmlns:o="urn:schemas-microsoft-com:office:office" xmlns:oel="http://schemas.microsoft.com/office/2019/extlst" xmlns:r="http://schemas.openxmlformats.org/officeDocument/2006/relationships" xmlns:m="http://schemas.openxmlformats.org/officeDocument/2006/math" xmlns:v="urn:schemas-microsoft-com:vml" xmlns:wp14="http://schemas.microsoft.com/office/word/2010/wordprocessingDrawing" xmlns:wp="http://schemas.openxmlformats.org/drawingml/2006/wordprocessingDrawing" xmlns:w10="urn:schemas-microsoft-com:office:word" xmlns:w="http://schemas.openxmlformats.org/wordprocessingml/2006/main" xmlns:w14="http://schemas.microsoft.com/office/word/2010/wordml" xmlns:w15="http://schemas.microsoft.com/office/word/2012/wordml" xmlns:w16cex="http://schemas.microsoft.com/office/word/2018/wordml/cex" xmlns:w16cid="http://schemas.microsoft.com/office/word/2016/wordml/cid" xmlns:w16="http://schemas.microsoft.com/office/word/2018/wordml" xmlns:w16du="http://schemas.microsoft.com/office/word/2023/wordml/word16du" xmlns:w16sdtdh="http://schemas.microsoft.com/office/word/2020/wordml/sdtdatahash" xmlns:w16sdtfl="http://schemas.microsoft.com/office/word/2024/wordml/sdtformatlock" xmlns:w16se="http://schemas.microsoft.com/office/word/2015/wordml/symex" xmlns:wpg="http://schemas.microsoft.com/office/word/2010/wordprocessingGroup" xmlns:wpi="http://schemas.microsoft.com/office/word/2010/wordprocessingInk" xmlns:wne="http://schemas.microsoft.com/office/word/2006/wordml" xmlns:wps="http://schemas.microsoft.com/office/word/2010/wordprocessingShape" mc:Ignorable="w14 w15 w16se w16cid w16 w16cex w16sdtdh w16sdtfl w16du wp14">
   <w:body>
     <w:p>
       <w:pPr>
@@ -98,11 +98,148 @@
       <w:pPr>
         <w:pStyle w:val="ListParagraph"/>
         <w:numPr>
+          <w:ilvl w:val="1"/>
+          <w:numId w:val="13"/>
+        </w:numPr>
+      </w:pPr>
+      <w:r>
+        <w:t>Fatores</w:t>
+      </w:r>
+    </w:p>
+    <w:p>
+      <w:pPr>
+        <w:pStyle w:val="ListParagraph"/>
+        <w:numPr>
           <w:ilvl w:val="2"/>
           <w:numId w:val="13"/>
         </w:numPr>
       </w:pPr>
       <w:r>
+        <w:t>Operações básicas</w:t>
+      </w:r>
+    </w:p>
+    <w:p>
+      <w:pPr>
+        <w:pStyle w:val="ListParagraph"/>
+        <w:numPr>
+          <w:ilvl w:val="2"/>
+          <w:numId w:val="13"/>
+        </w:numPr>
+      </w:pPr>
+      <w:r>
+        <w:t xml:space="preserve">Base de dados </w:t>
+      </w:r>
+      <w:proofErr w:type="spellStart"/>
+      <w:r>
+        <w:t>gss_cat</w:t>
+      </w:r>
+      <w:proofErr w:type="spellEnd"/>
+    </w:p>
+    <w:p>
+      <w:pPr>
+        <w:pStyle w:val="ListParagraph"/>
+        <w:numPr>
+          <w:ilvl w:val="2"/>
+          <w:numId w:val="13"/>
+        </w:numPr>
+      </w:pPr>
+      <w:r>
+        <w:t>Alterar ordem dos fatores</w:t>
+      </w:r>
+    </w:p>
+    <w:p>
+      <w:pPr>
+        <w:pStyle w:val="ListParagraph"/>
+        <w:numPr>
+          <w:ilvl w:val="2"/>
+          <w:numId w:val="13"/>
+        </w:numPr>
+      </w:pPr>
+      <w:r>
+        <w:t>Alterar os fatores</w:t>
+      </w:r>
+    </w:p>
+    <w:p>
+      <w:pPr>
+        <w:pStyle w:val="ListParagraph"/>
+        <w:numPr>
+          <w:ilvl w:val="1"/>
+          <w:numId w:val="13"/>
+        </w:numPr>
+      </w:pPr>
+      <w:r>
+        <w:t>Vetores lógicos</w:t>
+      </w:r>
+    </w:p>
+    <w:p>
+      <w:pPr>
+        <w:pStyle w:val="ListParagraph"/>
+        <w:numPr>
+          <w:ilvl w:val="2"/>
+          <w:numId w:val="13"/>
+        </w:numPr>
+      </w:pPr>
+      <w:r>
+        <w:t>Comparações</w:t>
+      </w:r>
+    </w:p>
+    <w:p>
+      <w:pPr>
+        <w:pStyle w:val="ListParagraph"/>
+        <w:numPr>
+          <w:ilvl w:val="2"/>
+          <w:numId w:val="13"/>
+        </w:numPr>
+      </w:pPr>
+      <w:r>
+        <w:t>Álgebra booleana</w:t>
+      </w:r>
+    </w:p>
+    <w:p>
+      <w:pPr>
+        <w:pStyle w:val="ListParagraph"/>
+        <w:numPr>
+          <w:ilvl w:val="2"/>
+          <w:numId w:val="13"/>
+        </w:numPr>
+      </w:pPr>
+      <w:r>
+        <w:t>Sumarização</w:t>
+      </w:r>
+    </w:p>
+    <w:p>
+      <w:pPr>
+        <w:pStyle w:val="ListParagraph"/>
+        <w:numPr>
+          <w:ilvl w:val="2"/>
+          <w:numId w:val="13"/>
+        </w:numPr>
+      </w:pPr>
+      <w:r>
+        <w:t>Transformações condicionais</w:t>
+      </w:r>
+    </w:p>
+    <w:p>
+      <w:pPr>
+        <w:pStyle w:val="ListParagraph"/>
+        <w:numPr>
+          <w:ilvl w:val="0"/>
+          <w:numId w:val="13"/>
+        </w:numPr>
+      </w:pPr>
+      <w:r>
+        <w:t>Exploração dos dados</w:t>
+      </w:r>
+    </w:p>
+    <w:p>
+      <w:pPr>
+        <w:pStyle w:val="ListParagraph"/>
+        <w:numPr>
+          <w:ilvl w:val="1"/>
+          <w:numId w:val="13"/>
+        </w:numPr>
+      </w:pPr>
+      <w:r>
         <w:t>Estatísticas descritivas</w:t>
       </w:r>
     </w:p>
@@ -115,7 +252,7 @@
         </w:numPr>
       </w:pPr>
       <w:r>
-        <w:t>Fatores</w:t>
+        <w:t>Variação</w:t>
       </w:r>
     </w:p>
     <w:p>
@@ -127,7 +264,7 @@
         </w:numPr>
       </w:pPr>
       <w:r>
-        <w:t>Operações básicas</w:t>
+        <w:t>Valores típicos</w:t>
       </w:r>
     </w:p>
     <w:p>
@@ -139,13 +276,196 @@
         </w:numPr>
       </w:pPr>
       <w:r>
-        <w:t xml:space="preserve">Base de dados </w:t>
+        <w:t>Valores invulgares</w:t>
+      </w:r>
+    </w:p>
+    <w:p>
+      <w:pPr>
+        <w:pStyle w:val="ListParagraph"/>
+        <w:numPr>
+          <w:ilvl w:val="1"/>
+          <w:numId w:val="13"/>
+        </w:numPr>
+      </w:pPr>
+      <w:r>
+        <w:t>Valores em falta</w:t>
+      </w:r>
+    </w:p>
+    <w:p>
+      <w:pPr>
+        <w:pStyle w:val="ListParagraph"/>
+        <w:numPr>
+          <w:ilvl w:val="2"/>
+          <w:numId w:val="13"/>
+        </w:numPr>
+      </w:pPr>
+      <w:r>
+        <w:t>Explícitos</w:t>
+      </w:r>
+    </w:p>
+    <w:p>
+      <w:pPr>
+        <w:pStyle w:val="ListParagraph"/>
+        <w:numPr>
+          <w:ilvl w:val="2"/>
+          <w:numId w:val="13"/>
+        </w:numPr>
+      </w:pPr>
+      <w:r>
+        <w:t>Implícitos</w:t>
+      </w:r>
+    </w:p>
+    <w:p>
+      <w:pPr>
+        <w:pStyle w:val="ListParagraph"/>
+        <w:numPr>
+          <w:ilvl w:val="2"/>
+          <w:numId w:val="13"/>
+        </w:numPr>
+      </w:pPr>
+      <w:r>
+        <w:t>Fatores e grupos vazios</w:t>
+      </w:r>
+    </w:p>
+    <w:p>
+      <w:pPr>
+        <w:pStyle w:val="ListParagraph"/>
+        <w:numPr>
+          <w:ilvl w:val="1"/>
+          <w:numId w:val="13"/>
+        </w:numPr>
+      </w:pPr>
+      <w:r>
+        <w:t>Covariação</w:t>
+      </w:r>
+    </w:p>
+    <w:p>
+      <w:pPr>
+        <w:pStyle w:val="ListParagraph"/>
+        <w:numPr>
+          <w:ilvl w:val="2"/>
+          <w:numId w:val="13"/>
+        </w:numPr>
+      </w:pPr>
+      <w:r>
+        <w:t>Uma variável categórica e uma numérica</w:t>
+      </w:r>
+    </w:p>
+    <w:p>
+      <w:pPr>
+        <w:pStyle w:val="ListParagraph"/>
+        <w:numPr>
+          <w:ilvl w:val="2"/>
+          <w:numId w:val="13"/>
+        </w:numPr>
+      </w:pPr>
+      <w:r>
+        <w:t>Duas variáveis categóricas</w:t>
+      </w:r>
+    </w:p>
+    <w:p>
+      <w:pPr>
+        <w:pStyle w:val="ListParagraph"/>
+        <w:numPr>
+          <w:ilvl w:val="2"/>
+          <w:numId w:val="13"/>
+        </w:numPr>
+      </w:pPr>
+      <w:r>
+        <w:t>Duas variáveis numéricas</w:t>
+      </w:r>
+    </w:p>
+    <w:p>
+      <w:pPr>
+        <w:pStyle w:val="ListParagraph"/>
+        <w:numPr>
+          <w:ilvl w:val="1"/>
+          <w:numId w:val="13"/>
+        </w:numPr>
+      </w:pPr>
+      <w:r>
+        <w:t>Padrões e Modelos</w:t>
+      </w:r>
+    </w:p>
+    <w:p>
+      <w:pPr>
+        <w:pStyle w:val="ListParagraph"/>
+        <w:numPr>
+          <w:ilvl w:val="0"/>
+          <w:numId w:val="13"/>
+        </w:numPr>
+      </w:pPr>
+      <w:r>
+        <w:t>Modelação</w:t>
+      </w:r>
+    </w:p>
+    <w:p>
+      <w:pPr>
+        <w:pStyle w:val="ListParagraph"/>
+        <w:numPr>
+          <w:ilvl w:val="1"/>
+          <w:numId w:val="13"/>
+        </w:numPr>
+      </w:pPr>
+      <w:r>
+        <w:t>Construção de modelo simples</w:t>
+      </w:r>
+    </w:p>
+    <w:p>
+      <w:pPr>
+        <w:pStyle w:val="ListParagraph"/>
+        <w:numPr>
+          <w:ilvl w:val="2"/>
+          <w:numId w:val="13"/>
+        </w:numPr>
+      </w:pPr>
+      <w:r>
+        <w:t>Explorar dados</w:t>
+      </w:r>
+    </w:p>
+    <w:p>
+      <w:pPr>
+        <w:pStyle w:val="ListParagraph"/>
+        <w:numPr>
+          <w:ilvl w:val="2"/>
+          <w:numId w:val="13"/>
+        </w:numPr>
+      </w:pPr>
+      <w:r>
+        <w:t>Ajustar modelo</w:t>
+      </w:r>
+    </w:p>
+    <w:p>
+      <w:pPr>
+        <w:pStyle w:val="ListParagraph"/>
+        <w:numPr>
+          <w:ilvl w:val="2"/>
+          <w:numId w:val="13"/>
+        </w:numPr>
+      </w:pPr>
+      <w:r>
+        <w:t>Usar modelo para previsão</w:t>
+      </w:r>
+    </w:p>
+    <w:p>
+      <w:pPr>
+        <w:pStyle w:val="ListParagraph"/>
+        <w:numPr>
+          <w:ilvl w:val="1"/>
+          <w:numId w:val="13"/>
+        </w:numPr>
+      </w:pPr>
+      <w:r>
+        <w:t xml:space="preserve">Construção de modelo com </w:t>
       </w:r>
       <w:proofErr w:type="spellStart"/>
       <w:r>
-        <w:t>gss_cat</w:t>
+        <w:t>workflow</w:t>
       </w:r>
       <w:proofErr w:type="spellEnd"/>
+      <w:r>
+        <w:t>()</w:t>
+      </w:r>
     </w:p>
     <w:p>
       <w:pPr>
@@ -156,7 +476,7 @@
         </w:numPr>
       </w:pPr>
       <w:r>
-        <w:t>Alterar ordem dos fatores</w:t>
+        <w:t>Explorar dados</w:t>
       </w:r>
     </w:p>
     <w:p>
@@ -168,7 +488,48 @@
         </w:numPr>
       </w:pPr>
       <w:r>
-        <w:t>Alterar os fatores</w:t>
+        <w:t>Dividir dados</w:t>
+      </w:r>
+    </w:p>
+    <w:p>
+      <w:pPr>
+        <w:pStyle w:val="ListParagraph"/>
+        <w:numPr>
+          <w:ilvl w:val="2"/>
+          <w:numId w:val="13"/>
+        </w:numPr>
+      </w:pPr>
+      <w:r>
+        <w:t xml:space="preserve">Criar </w:t>
+      </w:r>
+      <w:proofErr w:type="spellStart"/>
+      <w:r>
+        <w:t>workflow</w:t>
+      </w:r>
+      <w:proofErr w:type="spellEnd"/>
+    </w:p>
+    <w:p>
+      <w:pPr>
+        <w:pStyle w:val="ListParagraph"/>
+        <w:numPr>
+          <w:ilvl w:val="2"/>
+          <w:numId w:val="13"/>
+        </w:numPr>
+      </w:pPr>
+      <w:r>
+        <w:t>Ajustar modelo</w:t>
+      </w:r>
+    </w:p>
+    <w:p>
+      <w:pPr>
+        <w:pStyle w:val="ListParagraph"/>
+        <w:numPr>
+          <w:ilvl w:val="2"/>
+          <w:numId w:val="13"/>
+        </w:numPr>
+      </w:pPr>
+      <w:r>
+        <w:t>Avaliar modelo</w:t>
       </w:r>
     </w:p>
     <w:p>
@@ -180,386 +541,15 @@
         </w:numPr>
       </w:pPr>
       <w:r>
-        <w:t>Vetores lógicos</w:t>
-      </w:r>
-    </w:p>
-    <w:p>
-      <w:pPr>
-        <w:pStyle w:val="ListParagraph"/>
-        <w:numPr>
-          <w:ilvl w:val="2"/>
-          <w:numId w:val="13"/>
-        </w:numPr>
-      </w:pPr>
-      <w:r>
-        <w:t>Comparações</w:t>
-      </w:r>
-    </w:p>
-    <w:p>
-      <w:pPr>
-        <w:pStyle w:val="ListParagraph"/>
-        <w:numPr>
-          <w:ilvl w:val="2"/>
-          <w:numId w:val="13"/>
-        </w:numPr>
-      </w:pPr>
-      <w:r>
-        <w:t>Álgebra booleana</w:t>
-      </w:r>
-    </w:p>
-    <w:p>
-      <w:pPr>
-        <w:pStyle w:val="ListParagraph"/>
-        <w:numPr>
-          <w:ilvl w:val="2"/>
-          <w:numId w:val="13"/>
-        </w:numPr>
-      </w:pPr>
-      <w:r>
-        <w:t>Sumarização</w:t>
-      </w:r>
-    </w:p>
-    <w:p>
-      <w:pPr>
-        <w:pStyle w:val="ListParagraph"/>
-        <w:numPr>
-          <w:ilvl w:val="2"/>
-          <w:numId w:val="13"/>
-        </w:numPr>
-      </w:pPr>
-      <w:r>
-        <w:t>Transformações condicionais</w:t>
-      </w:r>
-    </w:p>
-    <w:p>
-      <w:pPr>
-        <w:pStyle w:val="ListParagraph"/>
-        <w:numPr>
-          <w:ilvl w:val="0"/>
-          <w:numId w:val="13"/>
-        </w:numPr>
-      </w:pPr>
-      <w:r>
-        <w:t>Exploração dos dados</w:t>
-      </w:r>
-    </w:p>
-    <w:p>
-      <w:pPr>
-        <w:pStyle w:val="ListParagraph"/>
-        <w:numPr>
-          <w:ilvl w:val="1"/>
-          <w:numId w:val="13"/>
-        </w:numPr>
-      </w:pPr>
-      <w:r>
-        <w:t>Variação</w:t>
-      </w:r>
-    </w:p>
-    <w:p>
-      <w:pPr>
-        <w:pStyle w:val="ListParagraph"/>
-        <w:numPr>
-          <w:ilvl w:val="2"/>
-          <w:numId w:val="13"/>
-        </w:numPr>
-      </w:pPr>
-      <w:r>
-        <w:t>Valores típicos</w:t>
-      </w:r>
-    </w:p>
-    <w:p>
-      <w:pPr>
-        <w:pStyle w:val="ListParagraph"/>
-        <w:numPr>
-          <w:ilvl w:val="2"/>
-          <w:numId w:val="13"/>
-        </w:numPr>
-      </w:pPr>
-      <w:r>
-        <w:t>Valores invulgares</w:t>
-      </w:r>
-    </w:p>
-    <w:p>
-      <w:pPr>
-        <w:pStyle w:val="ListParagraph"/>
-        <w:numPr>
-          <w:ilvl w:val="1"/>
-          <w:numId w:val="13"/>
-        </w:numPr>
-      </w:pPr>
-      <w:r>
-        <w:t>Valores em falta</w:t>
-      </w:r>
-    </w:p>
-    <w:p>
-      <w:pPr>
-        <w:pStyle w:val="ListParagraph"/>
-        <w:numPr>
-          <w:ilvl w:val="2"/>
-          <w:numId w:val="13"/>
-        </w:numPr>
-      </w:pPr>
-      <w:r>
-        <w:t>Explícitos</w:t>
-      </w:r>
-    </w:p>
-    <w:p>
-      <w:pPr>
-        <w:pStyle w:val="ListParagraph"/>
-        <w:numPr>
-          <w:ilvl w:val="2"/>
-          <w:numId w:val="13"/>
-        </w:numPr>
-      </w:pPr>
-      <w:r>
-        <w:t>Implícitos</w:t>
-      </w:r>
-    </w:p>
-    <w:p>
-      <w:pPr>
-        <w:pStyle w:val="ListParagraph"/>
-        <w:numPr>
-          <w:ilvl w:val="2"/>
-          <w:numId w:val="13"/>
-        </w:numPr>
-      </w:pPr>
-      <w:r>
-        <w:t>Fatores e grupos vazios</w:t>
-      </w:r>
-    </w:p>
-    <w:p>
-      <w:pPr>
-        <w:pStyle w:val="ListParagraph"/>
-        <w:numPr>
-          <w:ilvl w:val="1"/>
-          <w:numId w:val="13"/>
-        </w:numPr>
-      </w:pPr>
-      <w:r>
-        <w:t>Covariação</w:t>
-      </w:r>
-    </w:p>
-    <w:p>
-      <w:pPr>
-        <w:pStyle w:val="ListParagraph"/>
-        <w:numPr>
-          <w:ilvl w:val="2"/>
-          <w:numId w:val="13"/>
-        </w:numPr>
-      </w:pPr>
-      <w:r>
-        <w:t>Uma variável categórica e uma numérica</w:t>
-      </w:r>
-    </w:p>
-    <w:p>
-      <w:pPr>
-        <w:pStyle w:val="ListParagraph"/>
-        <w:numPr>
-          <w:ilvl w:val="2"/>
-          <w:numId w:val="13"/>
-        </w:numPr>
-      </w:pPr>
-      <w:r>
-        <w:t>Duas variáveis categóricas</w:t>
-      </w:r>
-    </w:p>
-    <w:p>
-      <w:pPr>
-        <w:pStyle w:val="ListParagraph"/>
-        <w:numPr>
-          <w:ilvl w:val="2"/>
-          <w:numId w:val="13"/>
-        </w:numPr>
-      </w:pPr>
-      <w:r>
-        <w:t>Duas variáveis numéricas</w:t>
-      </w:r>
-    </w:p>
-    <w:p>
-      <w:pPr>
-        <w:pStyle w:val="ListParagraph"/>
-        <w:numPr>
-          <w:ilvl w:val="1"/>
-          <w:numId w:val="13"/>
-        </w:numPr>
-      </w:pPr>
-      <w:r>
-        <w:t>Padrões e Modelos</w:t>
-      </w:r>
-    </w:p>
-    <w:p>
-      <w:pPr>
-        <w:pStyle w:val="ListParagraph"/>
-        <w:numPr>
-          <w:ilvl w:val="0"/>
-          <w:numId w:val="13"/>
-        </w:numPr>
-      </w:pPr>
-      <w:r>
-        <w:t>Modelação</w:t>
-      </w:r>
-    </w:p>
-    <w:p>
-      <w:pPr>
-        <w:pStyle w:val="ListParagraph"/>
-        <w:numPr>
-          <w:ilvl w:val="1"/>
-          <w:numId w:val="13"/>
-        </w:numPr>
-      </w:pPr>
-      <w:r>
-        <w:t>Construção de modelo simples</w:t>
-      </w:r>
-    </w:p>
-    <w:p>
-      <w:pPr>
-        <w:pStyle w:val="ListParagraph"/>
-        <w:numPr>
-          <w:ilvl w:val="2"/>
-          <w:numId w:val="13"/>
-        </w:numPr>
-      </w:pPr>
-      <w:r>
-        <w:t>Explorar dados</w:t>
-      </w:r>
-    </w:p>
-    <w:p>
-      <w:pPr>
-        <w:pStyle w:val="ListParagraph"/>
-        <w:numPr>
-          <w:ilvl w:val="2"/>
-          <w:numId w:val="13"/>
-        </w:numPr>
-      </w:pPr>
-      <w:r>
-        <w:t>Ajustar modelo</w:t>
-      </w:r>
-    </w:p>
-    <w:p>
-      <w:pPr>
-        <w:pStyle w:val="ListParagraph"/>
-        <w:numPr>
-          <w:ilvl w:val="2"/>
-          <w:numId w:val="13"/>
-        </w:numPr>
-      </w:pPr>
-      <w:r>
-        <w:t>Usar modelo para previsão</w:t>
-      </w:r>
-    </w:p>
-    <w:p>
-      <w:pPr>
-        <w:pStyle w:val="ListParagraph"/>
-        <w:numPr>
-          <w:ilvl w:val="1"/>
-          <w:numId w:val="13"/>
-        </w:numPr>
-      </w:pPr>
-      <w:r>
-        <w:t xml:space="preserve">Construção de modelo com </w:t>
+        <w:t xml:space="preserve">Construir vários modelos com </w:t>
       </w:r>
       <w:proofErr w:type="spellStart"/>
-      <w:proofErr w:type="gramStart"/>
       <w:r>
         <w:t>workflow</w:t>
       </w:r>
       <w:proofErr w:type="spellEnd"/>
       <w:r>
-        <w:t>(</w:t>
-      </w:r>
-      <w:proofErr w:type="gramEnd"/>
-      <w:r>
-        <w:t>)</w:t>
-      </w:r>
-    </w:p>
-    <w:p>
-      <w:pPr>
-        <w:pStyle w:val="ListParagraph"/>
-        <w:numPr>
-          <w:ilvl w:val="2"/>
-          <w:numId w:val="13"/>
-        </w:numPr>
-      </w:pPr>
-      <w:r>
-        <w:t>Explorar dados</w:t>
-      </w:r>
-    </w:p>
-    <w:p>
-      <w:pPr>
-        <w:pStyle w:val="ListParagraph"/>
-        <w:numPr>
-          <w:ilvl w:val="2"/>
-          <w:numId w:val="13"/>
-        </w:numPr>
-      </w:pPr>
-      <w:r>
-        <w:t>Dividir dados</w:t>
-      </w:r>
-    </w:p>
-    <w:p>
-      <w:pPr>
-        <w:pStyle w:val="ListParagraph"/>
-        <w:numPr>
-          <w:ilvl w:val="2"/>
-          <w:numId w:val="13"/>
-        </w:numPr>
-      </w:pPr>
-      <w:r>
-        <w:t xml:space="preserve">Criar </w:t>
-      </w:r>
-      <w:proofErr w:type="spellStart"/>
-      <w:r>
-        <w:t>workflow</w:t>
-      </w:r>
-      <w:proofErr w:type="spellEnd"/>
-    </w:p>
-    <w:p>
-      <w:pPr>
-        <w:pStyle w:val="ListParagraph"/>
-        <w:numPr>
-          <w:ilvl w:val="2"/>
-          <w:numId w:val="13"/>
-        </w:numPr>
-      </w:pPr>
-      <w:r>
-        <w:t>Ajustar modelo</w:t>
-      </w:r>
-    </w:p>
-    <w:p>
-      <w:pPr>
-        <w:pStyle w:val="ListParagraph"/>
-        <w:numPr>
-          <w:ilvl w:val="2"/>
-          <w:numId w:val="13"/>
-        </w:numPr>
-      </w:pPr>
-      <w:r>
-        <w:t>Avaliar modelo</w:t>
-      </w:r>
-    </w:p>
-    <w:p>
-      <w:pPr>
-        <w:pStyle w:val="ListParagraph"/>
-        <w:numPr>
-          <w:ilvl w:val="1"/>
-          <w:numId w:val="13"/>
-        </w:numPr>
-      </w:pPr>
-      <w:r>
-        <w:t xml:space="preserve">Construir vários modelos com </w:t>
-      </w:r>
-      <w:proofErr w:type="spellStart"/>
-      <w:proofErr w:type="gramStart"/>
-      <w:r>
-        <w:t>workflow</w:t>
-      </w:r>
-      <w:proofErr w:type="spellEnd"/>
-      <w:r>
-        <w:t>(</w:t>
-      </w:r>
-      <w:proofErr w:type="gramEnd"/>
-      <w:r>
-        <w:t>)</w:t>
+        <w:t>()</w:t>
       </w:r>
     </w:p>
     <w:p>
@@ -911,14 +901,9 @@
         <w:ind w:left="709"/>
       </w:pPr>
       <w:r>
-        <w:t xml:space="preserve">Aplicações </w:t>
-      </w:r>
-      <w:proofErr w:type="gramStart"/>
-      <w:r>
-        <w:t>interativas  (</w:t>
+        <w:t>Aplicações interativas  (</w:t>
       </w:r>
       <w:proofErr w:type="spellStart"/>
-      <w:proofErr w:type="gramEnd"/>
       <w:r>
         <w:t>ShinyApps</w:t>
       </w:r>
@@ -980,7 +965,7 @@
 </file>
 
 <file path=word/endnotes.xml><?xml version="1.0" encoding="utf-8"?>
-<w:endnotes xmlns:wpc="http://schemas.microsoft.com/office/word/2010/wordprocessingCanvas" xmlns:cx="http://schemas.microsoft.com/office/drawing/2014/chartex" xmlns:cx1="http://schemas.microsoft.com/office/drawing/2015/9/8/chartex" xmlns:cx2="http://schemas.microsoft.com/office/drawing/2015/10/21/chartex" xmlns:cx3="http://schemas.microsoft.com/office/drawing/2016/5/9/chartex" xmlns:cx4="http://schemas.microsoft.com/office/drawing/2016/5/10/chartex" xmlns:cx5="http://schemas.microsoft.com/office/drawing/2016/5/11/chartex" xmlns:cx6="http://schemas.microsoft.com/office/drawing/2016/5/12/chartex" xmlns:cx7="http://schemas.microsoft.com/office/drawing/2016/5/13/chartex" xmlns:cx8="http://schemas.microsoft.com/office/drawing/2016/5/14/chartex" xmlns:mc="http://schemas.openxmlformats.org/markup-compatibility/2006" xmlns:aink="http://schemas.microsoft.com/office/drawing/2016/ink" xmlns:am3d="http://schemas.microsoft.com/office/drawing/2017/model3d" xmlns:o="urn:schemas-microsoft-com:office:office" xmlns:oel="http://schemas.microsoft.com/office/2019/extlst" xmlns:r="http://schemas.openxmlformats.org/officeDocument/2006/relationships" xmlns:m="http://schemas.openxmlformats.org/officeDocument/2006/math" xmlns:v="urn:schemas-microsoft-com:vml" xmlns:wp14="http://schemas.microsoft.com/office/word/2010/wordprocessingDrawing" xmlns:wp="http://schemas.openxmlformats.org/drawingml/2006/wordprocessingDrawing" xmlns:w10="urn:schemas-microsoft-com:office:word" xmlns:w="http://schemas.openxmlformats.org/wordprocessingml/2006/main" xmlns:w14="http://schemas.microsoft.com/office/word/2010/wordml" xmlns:w15="http://schemas.microsoft.com/office/word/2012/wordml" xmlns:w16cex="http://schemas.microsoft.com/office/word/2018/wordml/cex" xmlns:w16cid="http://schemas.microsoft.com/office/word/2016/wordml/cid" xmlns:w16="http://schemas.microsoft.com/office/word/2018/wordml" xmlns:w16du="http://schemas.microsoft.com/office/word/2023/wordml/word16du" xmlns:w16sdtdh="http://schemas.microsoft.com/office/word/2020/wordml/sdtdatahash" xmlns:w16se="http://schemas.microsoft.com/office/word/2015/wordml/symex" xmlns:wpg="http://schemas.microsoft.com/office/word/2010/wordprocessingGroup" xmlns:wpi="http://schemas.microsoft.com/office/word/2010/wordprocessingInk" xmlns:wne="http://schemas.microsoft.com/office/word/2006/wordml" xmlns:wps="http://schemas.microsoft.com/office/word/2010/wordprocessingShape" mc:Ignorable="w14 w15 w16se w16cid w16 w16cex w16sdtdh w16du wp14">
+<w:endnotes xmlns:wpc="http://schemas.microsoft.com/office/word/2010/wordprocessingCanvas" xmlns:cx="http://schemas.microsoft.com/office/drawing/2014/chartex" xmlns:cx1="http://schemas.microsoft.com/office/drawing/2015/9/8/chartex" xmlns:cx2="http://schemas.microsoft.com/office/drawing/2015/10/21/chartex" xmlns:cx3="http://schemas.microsoft.com/office/drawing/2016/5/9/chartex" xmlns:cx4="http://schemas.microsoft.com/office/drawing/2016/5/10/chartex" xmlns:cx5="http://schemas.microsoft.com/office/drawing/2016/5/11/chartex" xmlns:cx6="http://schemas.microsoft.com/office/drawing/2016/5/12/chartex" xmlns:cx7="http://schemas.microsoft.com/office/drawing/2016/5/13/chartex" xmlns:cx8="http://schemas.microsoft.com/office/drawing/2016/5/14/chartex" xmlns:mc="http://schemas.openxmlformats.org/markup-compatibility/2006" xmlns:aink="http://schemas.microsoft.com/office/drawing/2016/ink" xmlns:am3d="http://schemas.microsoft.com/office/drawing/2017/model3d" xmlns:o="urn:schemas-microsoft-com:office:office" xmlns:oel="http://schemas.microsoft.com/office/2019/extlst" xmlns:r="http://schemas.openxmlformats.org/officeDocument/2006/relationships" xmlns:m="http://schemas.openxmlformats.org/officeDocument/2006/math" xmlns:v="urn:schemas-microsoft-com:vml" xmlns:wp14="http://schemas.microsoft.com/office/word/2010/wordprocessingDrawing" xmlns:wp="http://schemas.openxmlformats.org/drawingml/2006/wordprocessingDrawing" xmlns:w10="urn:schemas-microsoft-com:office:word" xmlns:w="http://schemas.openxmlformats.org/wordprocessingml/2006/main" xmlns:w14="http://schemas.microsoft.com/office/word/2010/wordml" xmlns:w15="http://schemas.microsoft.com/office/word/2012/wordml" xmlns:w16cex="http://schemas.microsoft.com/office/word/2018/wordml/cex" xmlns:w16cid="http://schemas.microsoft.com/office/word/2016/wordml/cid" xmlns:w16="http://schemas.microsoft.com/office/word/2018/wordml" xmlns:w16du="http://schemas.microsoft.com/office/word/2023/wordml/word16du" xmlns:w16sdtdh="http://schemas.microsoft.com/office/word/2020/wordml/sdtdatahash" xmlns:w16sdtfl="http://schemas.microsoft.com/office/word/2024/wordml/sdtformatlock" xmlns:w16se="http://schemas.microsoft.com/office/word/2015/wordml/symex" xmlns:wpg="http://schemas.microsoft.com/office/word/2010/wordprocessingGroup" xmlns:wpi="http://schemas.microsoft.com/office/word/2010/wordprocessingInk" xmlns:wne="http://schemas.microsoft.com/office/word/2006/wordml" xmlns:wps="http://schemas.microsoft.com/office/word/2010/wordprocessingShape" mc:Ignorable="w14 w15 w16se w16cid w16 w16cex w16sdtdh w16sdtfl w16du wp14">
   <w:endnote w:type="separator" w:id="-1">
     <w:p>
       <w:pPr>
@@ -1005,7 +990,7 @@
 </file>
 
 <file path=word/footer1.xml><?xml version="1.0" encoding="utf-8"?>
-<w:ftr xmlns:wpc="http://schemas.microsoft.com/office/word/2010/wordprocessingCanvas" xmlns:cx="http://schemas.microsoft.com/office/drawing/2014/chartex" xmlns:cx1="http://schemas.microsoft.com/office/drawing/2015/9/8/chartex" xmlns:cx2="http://schemas.microsoft.com/office/drawing/2015/10/21/chartex" xmlns:cx3="http://schemas.microsoft.com/office/drawing/2016/5/9/chartex" xmlns:cx4="http://schemas.microsoft.com/office/drawing/2016/5/10/chartex" xmlns:cx5="http://schemas.microsoft.com/office/drawing/2016/5/11/chartex" xmlns:cx6="http://schemas.microsoft.com/office/drawing/2016/5/12/chartex" xmlns:cx7="http://schemas.microsoft.com/office/drawing/2016/5/13/chartex" xmlns:cx8="http://schemas.microsoft.com/office/drawing/2016/5/14/chartex" xmlns:mc="http://schemas.openxmlformats.org/markup-compatibility/2006" xmlns:aink="http://schemas.microsoft.com/office/drawing/2016/ink" xmlns:am3d="http://schemas.microsoft.com/office/drawing/2017/model3d" xmlns:o="urn:schemas-microsoft-com:office:office" xmlns:oel="http://schemas.microsoft.com/office/2019/extlst" xmlns:r="http://schemas.openxmlformats.org/officeDocument/2006/relationships" xmlns:m="http://schemas.openxmlformats.org/officeDocument/2006/math" xmlns:v="urn:schemas-microsoft-com:vml" xmlns:wp14="http://schemas.microsoft.com/office/word/2010/wordprocessingDrawing" xmlns:wp="http://schemas.openxmlformats.org/drawingml/2006/wordprocessingDrawing" xmlns:w10="urn:schemas-microsoft-com:office:word" xmlns:w="http://schemas.openxmlformats.org/wordprocessingml/2006/main" xmlns:w14="http://schemas.microsoft.com/office/word/2010/wordml" xmlns:w15="http://schemas.microsoft.com/office/word/2012/wordml" xmlns:w16cex="http://schemas.microsoft.com/office/word/2018/wordml/cex" xmlns:w16cid="http://schemas.microsoft.com/office/word/2016/wordml/cid" xmlns:w16="http://schemas.microsoft.com/office/word/2018/wordml" xmlns:w16du="http://schemas.microsoft.com/office/word/2023/wordml/word16du" xmlns:w16sdtdh="http://schemas.microsoft.com/office/word/2020/wordml/sdtdatahash" xmlns:w16se="http://schemas.microsoft.com/office/word/2015/wordml/symex" xmlns:wpg="http://schemas.microsoft.com/office/word/2010/wordprocessingGroup" xmlns:wpi="http://schemas.microsoft.com/office/word/2010/wordprocessingInk" xmlns:wne="http://schemas.microsoft.com/office/word/2006/wordml" xmlns:wps="http://schemas.microsoft.com/office/word/2010/wordprocessingShape" mc:Ignorable="w14 w15 w16se w16cid w16 w16cex w16sdtdh w16du wp14">
+<w:ftr xmlns:wpc="http://schemas.microsoft.com/office/word/2010/wordprocessingCanvas" xmlns:cx="http://schemas.microsoft.com/office/drawing/2014/chartex" xmlns:cx1="http://schemas.microsoft.com/office/drawing/2015/9/8/chartex" xmlns:cx2="http://schemas.microsoft.com/office/drawing/2015/10/21/chartex" xmlns:cx3="http://schemas.microsoft.com/office/drawing/2016/5/9/chartex" xmlns:cx4="http://schemas.microsoft.com/office/drawing/2016/5/10/chartex" xmlns:cx5="http://schemas.microsoft.com/office/drawing/2016/5/11/chartex" xmlns:cx6="http://schemas.microsoft.com/office/drawing/2016/5/12/chartex" xmlns:cx7="http://schemas.microsoft.com/office/drawing/2016/5/13/chartex" xmlns:cx8="http://schemas.microsoft.com/office/drawing/2016/5/14/chartex" xmlns:mc="http://schemas.openxmlformats.org/markup-compatibility/2006" xmlns:aink="http://schemas.microsoft.com/office/drawing/2016/ink" xmlns:am3d="http://schemas.microsoft.com/office/drawing/2017/model3d" xmlns:o="urn:schemas-microsoft-com:office:office" xmlns:oel="http://schemas.microsoft.com/office/2019/extlst" xmlns:r="http://schemas.openxmlformats.org/officeDocument/2006/relationships" xmlns:m="http://schemas.openxmlformats.org/officeDocument/2006/math" xmlns:v="urn:schemas-microsoft-com:vml" xmlns:wp14="http://schemas.microsoft.com/office/word/2010/wordprocessingDrawing" xmlns:wp="http://schemas.openxmlformats.org/drawingml/2006/wordprocessingDrawing" xmlns:w10="urn:schemas-microsoft-com:office:word" xmlns:w="http://schemas.openxmlformats.org/wordprocessingml/2006/main" xmlns:w14="http://schemas.microsoft.com/office/word/2010/wordml" xmlns:w15="http://schemas.microsoft.com/office/word/2012/wordml" xmlns:w16cex="http://schemas.microsoft.com/office/word/2018/wordml/cex" xmlns:w16cid="http://schemas.microsoft.com/office/word/2016/wordml/cid" xmlns:w16="http://schemas.microsoft.com/office/word/2018/wordml" xmlns:w16du="http://schemas.microsoft.com/office/word/2023/wordml/word16du" xmlns:w16sdtdh="http://schemas.microsoft.com/office/word/2020/wordml/sdtdatahash" xmlns:w16sdtfl="http://schemas.microsoft.com/office/word/2024/wordml/sdtformatlock" xmlns:w16se="http://schemas.microsoft.com/office/word/2015/wordml/symex" xmlns:wpg="http://schemas.microsoft.com/office/word/2010/wordprocessingGroup" xmlns:wpi="http://schemas.microsoft.com/office/word/2010/wordprocessingInk" xmlns:wne="http://schemas.microsoft.com/office/word/2006/wordml" xmlns:wps="http://schemas.microsoft.com/office/word/2010/wordprocessingShape" mc:Ignorable="w14 w15 w16se w16cid w16 w16cex w16sdtdh w16sdtfl w16du wp14">
   <w:p>
     <w:pPr>
       <w:pStyle w:val="Footer"/>
@@ -1147,7 +1132,7 @@
 </file>
 
 <file path=word/footnotes.xml><?xml version="1.0" encoding="utf-8"?>
-<w:footnotes xmlns:wpc="http://schemas.microsoft.com/office/word/2010/wordprocessingCanvas" xmlns:cx="http://schemas.microsoft.com/office/drawing/2014/chartex" xmlns:cx1="http://schemas.microsoft.com/office/drawing/2015/9/8/chartex" xmlns:cx2="http://schemas.microsoft.com/office/drawing/2015/10/21/chartex" xmlns:cx3="http://schemas.microsoft.com/office/drawing/2016/5/9/chartex" xmlns:cx4="http://schemas.microsoft.com/office/drawing/2016/5/10/chartex" xmlns:cx5="http://schemas.microsoft.com/office/drawing/2016/5/11/chartex" xmlns:cx6="http://schemas.microsoft.com/office/drawing/2016/5/12/chartex" xmlns:cx7="http://schemas.microsoft.com/office/drawing/2016/5/13/chartex" xmlns:cx8="http://schemas.microsoft.com/office/drawing/2016/5/14/chartex" xmlns:mc="http://schemas.openxmlformats.org/markup-compatibility/2006" xmlns:aink="http://schemas.microsoft.com/office/drawing/2016/ink" xmlns:am3d="http://schemas.microsoft.com/office/drawing/2017/model3d" xmlns:o="urn:schemas-microsoft-com:office:office" xmlns:oel="http://schemas.microsoft.com/office/2019/extlst" xmlns:r="http://schemas.openxmlformats.org/officeDocument/2006/relationships" xmlns:m="http://schemas.openxmlformats.org/officeDocument/2006/math" xmlns:v="urn:schemas-microsoft-com:vml" xmlns:wp14="http://schemas.microsoft.com/office/word/2010/wordprocessingDrawing" xmlns:wp="http://schemas.openxmlformats.org/drawingml/2006/wordprocessingDrawing" xmlns:w10="urn:schemas-microsoft-com:office:word" xmlns:w="http://schemas.openxmlformats.org/wordprocessingml/2006/main" xmlns:w14="http://schemas.microsoft.com/office/word/2010/wordml" xmlns:w15="http://schemas.microsoft.com/office/word/2012/wordml" xmlns:w16cex="http://schemas.microsoft.com/office/word/2018/wordml/cex" xmlns:w16cid="http://schemas.microsoft.com/office/word/2016/wordml/cid" xmlns:w16="http://schemas.microsoft.com/office/word/2018/wordml" xmlns:w16du="http://schemas.microsoft.com/office/word/2023/wordml/word16du" xmlns:w16sdtdh="http://schemas.microsoft.com/office/word/2020/wordml/sdtdatahash" xmlns:w16se="http://schemas.microsoft.com/office/word/2015/wordml/symex" xmlns:wpg="http://schemas.microsoft.com/office/word/2010/wordprocessingGroup" xmlns:wpi="http://schemas.microsoft.com/office/word/2010/wordprocessingInk" xmlns:wne="http://schemas.microsoft.com/office/word/2006/wordml" xmlns:wps="http://schemas.microsoft.com/office/word/2010/wordprocessingShape" mc:Ignorable="w14 w15 w16se w16cid w16 w16cex w16sdtdh w16du wp14">
+<w:footnotes xmlns:wpc="http://schemas.microsoft.com/office/word/2010/wordprocessingCanvas" xmlns:cx="http://schemas.microsoft.com/office/drawing/2014/chartex" xmlns:cx1="http://schemas.microsoft.com/office/drawing/2015/9/8/chartex" xmlns:cx2="http://schemas.microsoft.com/office/drawing/2015/10/21/chartex" xmlns:cx3="http://schemas.microsoft.com/office/drawing/2016/5/9/chartex" xmlns:cx4="http://schemas.microsoft.com/office/drawing/2016/5/10/chartex" xmlns:cx5="http://schemas.microsoft.com/office/drawing/2016/5/11/chartex" xmlns:cx6="http://schemas.microsoft.com/office/drawing/2016/5/12/chartex" xmlns:cx7="http://schemas.microsoft.com/office/drawing/2016/5/13/chartex" xmlns:cx8="http://schemas.microsoft.com/office/drawing/2016/5/14/chartex" xmlns:mc="http://schemas.openxmlformats.org/markup-compatibility/2006" xmlns:aink="http://schemas.microsoft.com/office/drawing/2016/ink" xmlns:am3d="http://schemas.microsoft.com/office/drawing/2017/model3d" xmlns:o="urn:schemas-microsoft-com:office:office" xmlns:oel="http://schemas.microsoft.com/office/2019/extlst" xmlns:r="http://schemas.openxmlformats.org/officeDocument/2006/relationships" xmlns:m="http://schemas.openxmlformats.org/officeDocument/2006/math" xmlns:v="urn:schemas-microsoft-com:vml" xmlns:wp14="http://schemas.microsoft.com/office/word/2010/wordprocessingDrawing" xmlns:wp="http://schemas.openxmlformats.org/drawingml/2006/wordprocessingDrawing" xmlns:w10="urn:schemas-microsoft-com:office:word" xmlns:w="http://schemas.openxmlformats.org/wordprocessingml/2006/main" xmlns:w14="http://schemas.microsoft.com/office/word/2010/wordml" xmlns:w15="http://schemas.microsoft.com/office/word/2012/wordml" xmlns:w16cex="http://schemas.microsoft.com/office/word/2018/wordml/cex" xmlns:w16cid="http://schemas.microsoft.com/office/word/2016/wordml/cid" xmlns:w16="http://schemas.microsoft.com/office/word/2018/wordml" xmlns:w16du="http://schemas.microsoft.com/office/word/2023/wordml/word16du" xmlns:w16sdtdh="http://schemas.microsoft.com/office/word/2020/wordml/sdtdatahash" xmlns:w16sdtfl="http://schemas.microsoft.com/office/word/2024/wordml/sdtformatlock" xmlns:w16se="http://schemas.microsoft.com/office/word/2015/wordml/symex" xmlns:wpg="http://schemas.microsoft.com/office/word/2010/wordprocessingGroup" xmlns:wpi="http://schemas.microsoft.com/office/word/2010/wordprocessingInk" xmlns:wne="http://schemas.microsoft.com/office/word/2006/wordml" xmlns:wps="http://schemas.microsoft.com/office/word/2010/wordprocessingShape" mc:Ignorable="w14 w15 w16se w16cid w16 w16cex w16sdtdh w16sdtfl w16du wp14">
   <w:footnote w:type="separator" w:id="-1">
     <w:p>
       <w:pPr>
@@ -1172,7 +1157,7 @@
 </file>
 
 <file path=word/header1.xml><?xml version="1.0" encoding="utf-8"?>
-<w:hdr xmlns:wpc="http://schemas.microsoft.com/office/word/2010/wordprocessingCanvas" xmlns:cx="http://schemas.microsoft.com/office/drawing/2014/chartex" xmlns:cx1="http://schemas.microsoft.com/office/drawing/2015/9/8/chartex" xmlns:cx2="http://schemas.microsoft.com/office/drawing/2015/10/21/chartex" xmlns:cx3="http://schemas.microsoft.com/office/drawing/2016/5/9/chartex" xmlns:cx4="http://schemas.microsoft.com/office/drawing/2016/5/10/chartex" xmlns:cx5="http://schemas.microsoft.com/office/drawing/2016/5/11/chartex" xmlns:cx6="http://schemas.microsoft.com/office/drawing/2016/5/12/chartex" xmlns:cx7="http://schemas.microsoft.com/office/drawing/2016/5/13/chartex" xmlns:cx8="http://schemas.microsoft.com/office/drawing/2016/5/14/chartex" xmlns:mc="http://schemas.openxmlformats.org/markup-compatibility/2006" xmlns:aink="http://schemas.microsoft.com/office/drawing/2016/ink" xmlns:am3d="http://schemas.microsoft.com/office/drawing/2017/model3d" xmlns:o="urn:schemas-microsoft-com:office:office" xmlns:oel="http://schemas.microsoft.com/office/2019/extlst" xmlns:r="http://schemas.openxmlformats.org/officeDocument/2006/relationships" xmlns:m="http://schemas.openxmlformats.org/officeDocument/2006/math" xmlns:v="urn:schemas-microsoft-com:vml" xmlns:wp14="http://schemas.microsoft.com/office/word/2010/wordprocessingDrawing" xmlns:wp="http://schemas.openxmlformats.org/drawingml/2006/wordprocessingDrawing" xmlns:w10="urn:schemas-microsoft-com:office:word" xmlns:w="http://schemas.openxmlformats.org/wordprocessingml/2006/main" xmlns:w14="http://schemas.microsoft.com/office/word/2010/wordml" xmlns:w15="http://schemas.microsoft.com/office/word/2012/wordml" xmlns:w16cex="http://schemas.microsoft.com/office/word/2018/wordml/cex" xmlns:w16cid="http://schemas.microsoft.com/office/word/2016/wordml/cid" xmlns:w16="http://schemas.microsoft.com/office/word/2018/wordml" xmlns:w16du="http://schemas.microsoft.com/office/word/2023/wordml/word16du" xmlns:w16sdtdh="http://schemas.microsoft.com/office/word/2020/wordml/sdtdatahash" xmlns:w16se="http://schemas.microsoft.com/office/word/2015/wordml/symex" xmlns:wpg="http://schemas.microsoft.com/office/word/2010/wordprocessingGroup" xmlns:wpi="http://schemas.microsoft.com/office/word/2010/wordprocessingInk" xmlns:wne="http://schemas.microsoft.com/office/word/2006/wordml" xmlns:wps="http://schemas.microsoft.com/office/word/2010/wordprocessingShape" mc:Ignorable="w14 w15 w16se w16cid w16 w16cex w16sdtdh w16du wp14">
+<w:hdr xmlns:wpc="http://schemas.microsoft.com/office/word/2010/wordprocessingCanvas" xmlns:cx="http://schemas.microsoft.com/office/drawing/2014/chartex" xmlns:cx1="http://schemas.microsoft.com/office/drawing/2015/9/8/chartex" xmlns:cx2="http://schemas.microsoft.com/office/drawing/2015/10/21/chartex" xmlns:cx3="http://schemas.microsoft.com/office/drawing/2016/5/9/chartex" xmlns:cx4="http://schemas.microsoft.com/office/drawing/2016/5/10/chartex" xmlns:cx5="http://schemas.microsoft.com/office/drawing/2016/5/11/chartex" xmlns:cx6="http://schemas.microsoft.com/office/drawing/2016/5/12/chartex" xmlns:cx7="http://schemas.microsoft.com/office/drawing/2016/5/13/chartex" xmlns:cx8="http://schemas.microsoft.com/office/drawing/2016/5/14/chartex" xmlns:mc="http://schemas.openxmlformats.org/markup-compatibility/2006" xmlns:aink="http://schemas.microsoft.com/office/drawing/2016/ink" xmlns:am3d="http://schemas.microsoft.com/office/drawing/2017/model3d" xmlns:o="urn:schemas-microsoft-com:office:office" xmlns:oel="http://schemas.microsoft.com/office/2019/extlst" xmlns:r="http://schemas.openxmlformats.org/officeDocument/2006/relationships" xmlns:m="http://schemas.openxmlformats.org/officeDocument/2006/math" xmlns:v="urn:schemas-microsoft-com:vml" xmlns:wp14="http://schemas.microsoft.com/office/word/2010/wordprocessingDrawing" xmlns:wp="http://schemas.openxmlformats.org/drawingml/2006/wordprocessingDrawing" xmlns:w10="urn:schemas-microsoft-com:office:word" xmlns:w="http://schemas.openxmlformats.org/wordprocessingml/2006/main" xmlns:w14="http://schemas.microsoft.com/office/word/2010/wordml" xmlns:w15="http://schemas.microsoft.com/office/word/2012/wordml" xmlns:w16cex="http://schemas.microsoft.com/office/word/2018/wordml/cex" xmlns:w16cid="http://schemas.microsoft.com/office/word/2016/wordml/cid" xmlns:w16="http://schemas.microsoft.com/office/word/2018/wordml" xmlns:w16du="http://schemas.microsoft.com/office/word/2023/wordml/word16du" xmlns:w16sdtdh="http://schemas.microsoft.com/office/word/2020/wordml/sdtdatahash" xmlns:w16sdtfl="http://schemas.microsoft.com/office/word/2024/wordml/sdtformatlock" xmlns:w16se="http://schemas.microsoft.com/office/word/2015/wordml/symex" xmlns:wpg="http://schemas.microsoft.com/office/word/2010/wordprocessingGroup" xmlns:wpi="http://schemas.microsoft.com/office/word/2010/wordprocessingInk" xmlns:wne="http://schemas.microsoft.com/office/word/2006/wordml" xmlns:wps="http://schemas.microsoft.com/office/word/2010/wordprocessingShape" mc:Ignorable="w14 w15 w16se w16cid w16 w16cex w16sdtdh w16sdtfl w16du wp14">
   <w:p>
     <w:pPr>
       <w:pStyle w:val="Header"/>
@@ -1249,7 +1234,7 @@
 </file>
 
 <file path=word/numbering.xml><?xml version="1.0" encoding="utf-8"?>
-<w:numbering xmlns:wpc="http://schemas.microsoft.com/office/word/2010/wordprocessingCanvas" xmlns:cx="http://schemas.microsoft.com/office/drawing/2014/chartex" xmlns:cx1="http://schemas.microsoft.com/office/drawing/2015/9/8/chartex" xmlns:cx2="http://schemas.microsoft.com/office/drawing/2015/10/21/chartex" xmlns:cx3="http://schemas.microsoft.com/office/drawing/2016/5/9/chartex" xmlns:cx4="http://schemas.microsoft.com/office/drawing/2016/5/10/chartex" xmlns:cx5="http://schemas.microsoft.com/office/drawing/2016/5/11/chartex" xmlns:cx6="http://schemas.microsoft.com/office/drawing/2016/5/12/chartex" xmlns:cx7="http://schemas.microsoft.com/office/drawing/2016/5/13/chartex" xmlns:cx8="http://schemas.microsoft.com/office/drawing/2016/5/14/chartex" xmlns:mc="http://schemas.openxmlformats.org/markup-compatibility/2006" xmlns:aink="http://schemas.microsoft.com/office/drawing/2016/ink" xmlns:am3d="http://schemas.microsoft.com/office/drawing/2017/model3d" xmlns:o="urn:schemas-microsoft-com:office:office" xmlns:oel="http://schemas.microsoft.com/office/2019/extlst" xmlns:r="http://schemas.openxmlformats.org/officeDocument/2006/relationships" xmlns:m="http://schemas.openxmlformats.org/officeDocument/2006/math" xmlns:v="urn:schemas-microsoft-com:vml" xmlns:wp14="http://schemas.microsoft.com/office/word/2010/wordprocessingDrawing" xmlns:wp="http://schemas.openxmlformats.org/drawingml/2006/wordprocessingDrawing" xmlns:w10="urn:schemas-microsoft-com:office:word" xmlns:w="http://schemas.openxmlformats.org/wordprocessingml/2006/main" xmlns:w14="http://schemas.microsoft.com/office/word/2010/wordml" xmlns:w15="http://schemas.microsoft.com/office/word/2012/wordml" xmlns:w16cex="http://schemas.microsoft.com/office/word/2018/wordml/cex" xmlns:w16cid="http://schemas.microsoft.com/office/word/2016/wordml/cid" xmlns:w16="http://schemas.microsoft.com/office/word/2018/wordml" xmlns:w16du="http://schemas.microsoft.com/office/word/2023/wordml/word16du" xmlns:w16sdtdh="http://schemas.microsoft.com/office/word/2020/wordml/sdtdatahash" xmlns:w16se="http://schemas.microsoft.com/office/word/2015/wordml/symex" xmlns:wpg="http://schemas.microsoft.com/office/word/2010/wordprocessingGroup" xmlns:wpi="http://schemas.microsoft.com/office/word/2010/wordprocessingInk" xmlns:wne="http://schemas.microsoft.com/office/word/2006/wordml" xmlns:wps="http://schemas.microsoft.com/office/word/2010/wordprocessingShape" mc:Ignorable="w14 w15 w16se w16cid w16 w16cex w16sdtdh w16du wp14">
+<w:numbering xmlns:wpc="http://schemas.microsoft.com/office/word/2010/wordprocessingCanvas" xmlns:cx="http://schemas.microsoft.com/office/drawing/2014/chartex" xmlns:cx1="http://schemas.microsoft.com/office/drawing/2015/9/8/chartex" xmlns:cx2="http://schemas.microsoft.com/office/drawing/2015/10/21/chartex" xmlns:cx3="http://schemas.microsoft.com/office/drawing/2016/5/9/chartex" xmlns:cx4="http://schemas.microsoft.com/office/drawing/2016/5/10/chartex" xmlns:cx5="http://schemas.microsoft.com/office/drawing/2016/5/11/chartex" xmlns:cx6="http://schemas.microsoft.com/office/drawing/2016/5/12/chartex" xmlns:cx7="http://schemas.microsoft.com/office/drawing/2016/5/13/chartex" xmlns:cx8="http://schemas.microsoft.com/office/drawing/2016/5/14/chartex" xmlns:mc="http://schemas.openxmlformats.org/markup-compatibility/2006" xmlns:aink="http://schemas.microsoft.com/office/drawing/2016/ink" xmlns:am3d="http://schemas.microsoft.com/office/drawing/2017/model3d" xmlns:o="urn:schemas-microsoft-com:office:office" xmlns:oel="http://schemas.microsoft.com/office/2019/extlst" xmlns:r="http://schemas.openxmlformats.org/officeDocument/2006/relationships" xmlns:m="http://schemas.openxmlformats.org/officeDocument/2006/math" xmlns:v="urn:schemas-microsoft-com:vml" xmlns:wp14="http://schemas.microsoft.com/office/word/2010/wordprocessingDrawing" xmlns:wp="http://schemas.openxmlformats.org/drawingml/2006/wordprocessingDrawing" xmlns:w10="urn:schemas-microsoft-com:office:word" xmlns:w="http://schemas.openxmlformats.org/wordprocessingml/2006/main" xmlns:w14="http://schemas.microsoft.com/office/word/2010/wordml" xmlns:w15="http://schemas.microsoft.com/office/word/2012/wordml" xmlns:w16cex="http://schemas.microsoft.com/office/word/2018/wordml/cex" xmlns:w16cid="http://schemas.microsoft.com/office/word/2016/wordml/cid" xmlns:w16="http://schemas.microsoft.com/office/word/2018/wordml" xmlns:w16du="http://schemas.microsoft.com/office/word/2023/wordml/word16du" xmlns:w16sdtdh="http://schemas.microsoft.com/office/word/2020/wordml/sdtdatahash" xmlns:w16sdtfl="http://schemas.microsoft.com/office/word/2024/wordml/sdtformatlock" xmlns:w16se="http://schemas.microsoft.com/office/word/2015/wordml/symex" xmlns:wpg="http://schemas.microsoft.com/office/word/2010/wordprocessingGroup" xmlns:wpi="http://schemas.microsoft.com/office/word/2010/wordprocessingInk" xmlns:wne="http://schemas.microsoft.com/office/word/2006/wordml" xmlns:wps="http://schemas.microsoft.com/office/word/2010/wordprocessingShape" mc:Ignorable="w14 w15 w16se w16cid w16 w16cex w16sdtdh w16sdtfl w16du wp14">
   <w:numPicBullet w:numPicBulletId="0">
     <w:pict>
       <v:shapetype id="_x0000_t75" coordsize="21600,21600" o:spt="75" o:preferrelative="t" path="m@4@5l@4@11@9@11@9@5xe" filled="f" stroked="f">
@@ -1271,7 +1256,7 @@
         <v:path o:extrusionok="f" gradientshapeok="t" o:connecttype="rect"/>
         <o:lock v:ext="edit" aspectratio="t"/>
       </v:shapetype>
-      <v:shape id="_x0000_i1033" type="#_x0000_t75" style="width:11.25pt;height:11.25pt" o:bullet="t">
+      <v:shape id="_x0000_i1025" type="#_x0000_t75" style="width:11.25pt;height:11.25pt" o:bullet="t">
         <v:imagedata r:id="rId1" o:title="mso1F80"/>
       </v:shape>
     </w:pict>
@@ -2976,7 +2961,7 @@
 </file>
 
 <file path=word/styles.xml><?xml version="1.0" encoding="utf-8"?>
-<w:styles xmlns:mc="http://schemas.openxmlformats.org/markup-compatibility/2006" xmlns:r="http://schemas.openxmlformats.org/officeDocument/2006/relationships" xmlns:w="http://schemas.openxmlformats.org/wordprocessingml/2006/main" xmlns:w14="http://schemas.microsoft.com/office/word/2010/wordml" xmlns:w15="http://schemas.microsoft.com/office/word/2012/wordml" xmlns:w16cex="http://schemas.microsoft.com/office/word/2018/wordml/cex" xmlns:w16cid="http://schemas.microsoft.com/office/word/2016/wordml/cid" xmlns:w16="http://schemas.microsoft.com/office/word/2018/wordml" xmlns:w16du="http://schemas.microsoft.com/office/word/2023/wordml/word16du" xmlns:w16sdtdh="http://schemas.microsoft.com/office/word/2020/wordml/sdtdatahash" xmlns:w16se="http://schemas.microsoft.com/office/word/2015/wordml/symex" mc:Ignorable="w14 w15 w16se w16cid w16 w16cex w16sdtdh w16du">
+<w:styles xmlns:mc="http://schemas.openxmlformats.org/markup-compatibility/2006" xmlns:r="http://schemas.openxmlformats.org/officeDocument/2006/relationships" xmlns:w="http://schemas.openxmlformats.org/wordprocessingml/2006/main" xmlns:w14="http://schemas.microsoft.com/office/word/2010/wordml" xmlns:w15="http://schemas.microsoft.com/office/word/2012/wordml" xmlns:w16cex="http://schemas.microsoft.com/office/word/2018/wordml/cex" xmlns:w16cid="http://schemas.microsoft.com/office/word/2016/wordml/cid" xmlns:w16="http://schemas.microsoft.com/office/word/2018/wordml" xmlns:w16du="http://schemas.microsoft.com/office/word/2023/wordml/word16du" xmlns:w16sdtdh="http://schemas.microsoft.com/office/word/2020/wordml/sdtdatahash" xmlns:w16sdtfl="http://schemas.microsoft.com/office/word/2024/wordml/sdtformatlock" xmlns:w16se="http://schemas.microsoft.com/office/word/2015/wordml/symex" mc:Ignorable="w14 w15 w16se w16cid w16 w16cex w16sdtdh w16sdtfl w16du">
   <w:docDefaults>
     <w:rPrDefault>
       <w:rPr>

</xml_diff>